<commit_message>
chỉnh sửa use case dễ nhìn hơn và thêm mqh
</commit_message>
<xml_diff>
--- a/sơ đồ use case tổng quát.docx
+++ b/sơ đồ use case tổng quát.docx
@@ -5,8 +5,8 @@
     <w:p>
       <w:r>
         <w:drawing>
-          <wp:inline distT="0" distB="0" distL="0" distR="0" wp14:anchorId="5BB7A43D" wp14:editId="6807AB47">
-            <wp:extent cx="5943600" cy="3856990"/>
+          <wp:inline distT="0" distB="0" distL="0" distR="0" wp14:anchorId="6885763B" wp14:editId="27C715D9">
+            <wp:extent cx="5943600" cy="4519930"/>
             <wp:effectExtent l="0" t="0" r="0" b="0"/>
             <wp:docPr id="1" name="Picture 1"/>
             <wp:cNvGraphicFramePr>
@@ -28,7 +28,7 @@
                   <pic:spPr>
                     <a:xfrm>
                       <a:off x="0" y="0"/>
-                      <a:ext cx="5943600" cy="3856990"/>
+                      <a:ext cx="5943600" cy="4519930"/>
                     </a:xfrm>
                     <a:prstGeom prst="rect">
                       <a:avLst/>
@@ -60,21 +60,15 @@
       </w:r>
       <w:proofErr w:type="spellEnd"/>
       <w:r>
-        <w:t xml:space="preserve">: </w:t>
+        <w:t>:</w:t>
       </w:r>
-      <w:hyperlink r:id="rId5" w:history="1">
-        <w:r>
-          <w:rPr>
-            <w:rStyle w:val="Hyperlink"/>
-          </w:rPr>
-          <w:t>https://drive.google.com/file/d/1f8J-maKBNPGQur6veM6B-v2mSal84Ssz/view?usp=sharing</w:t>
-        </w:r>
-      </w:hyperlink>
-    </w:p>
-    <w:p>
       <w:bookmarkStart w:id="0" w:name="_GoBack"/>
       <w:bookmarkEnd w:id="0"/>
+      <w:r>
+        <w:t xml:space="preserve"> https://drive.google.com/file/d/1UPAYaNt9PHjw-fNYwYhFUmfGUyz1x4ln/view?usp=sharing</w:t>
+      </w:r>
     </w:p>
+    <w:p/>
     <w:sectPr>
       <w:pgSz w:w="12240" w:h="15840"/>
       <w:pgMar w:top="1440" w:right="1440" w:bottom="1440" w:left="1440" w:header="708" w:footer="708" w:gutter="0"/>

</xml_diff>